<commit_message>
feat: complete backend endpoints, system backup/restore, audit logging, and dynamic user management
</commit_message>
<xml_diff>
--- a/Backend/templates/template_customs.docx
+++ b/Backend/templates/template_customs.docx
@@ -156,9 +156,7 @@
           <w:sz w:val="23"/>
           <w:rFonts w:ascii="TAU-Marutham" w:hAnsi="TAU-Marutham" w:cs="TAU-Marutham" w:eastAsia="TAU-Marutham"/>
         </w:rPr>
-        <w:t>1. {{issuing_authority_name}}, கடித F.NO. {{case_file_no}}, நாள் {{order_date}}.</w:t>
-        <w:br/>
-        <w:t>2. Order in Original No. {{order_in_original_no}}, நாள் {{letter_date}}.</w:t>
+        <w:t>{{ reference_text }}</w:t>
       </w:r>
     </w:p>
     <w:p>

</xml_diff>